<commit_message>
feat: Farmatodo route style — prefix /ftd-spi-employee/rest, verb-at-end paths
- Base prefix api/v1 -> ftd-spi-employee/rest (matches gateway convention)
- employee/create|get|list|update|delete, security/token; health outside prefix
- controllers, e2e, Postman, docs (md+docx) updated; 78 unit + 15 e2e green

Co-Authored-By: Claude Fable 5 <noreply@anthropic.com>
</commit_message>
<xml_diff>
--- a/docs/sdd/SDD-ftd-spi-employee-v1.0.docx
+++ b/docs/sdd/SDD-ftd-spi-employee-v1.0.docx
@@ -908,7 +908,7 @@
                 <w:sz w:val="20"/>
                 <w:szCs w:val="20"/>
               </w:rPr>
-              <w:t xml:space="preserve">POST /auth/token (JWT RS256 TTL 12h); CRUD /api/v1/employees vía PKG (MERGE/GET JSON); middleware X-Country-Code ISO 3166-1 alfa-2; pools Oracle por país (VE activo); Cloud Run + Cloud Build; Swagger; SonarQube ≥80%</w:t>
+              <w:t xml:space="preserve">POST /auth/token (JWT RS256 TTL 12h); CRUD /ftd-spi-employee/rest/employee/create vía PKG (MERGE/GET JSON); middleware X-Country-Code ISO 3166-1 alfa-2; pools Oracle por país (VE activo); Cloud Run + Cloud Build; Swagger; SonarQube ≥80%</w:t>
             </w:r>
           </w:p>
         </w:tc>
@@ -2260,7 +2260,7 @@
           <w:sz w:val="24"/>
           <w:szCs w:val="24"/>
         </w:rPr>
-        <w:t xml:space="preserve">POST /api/v1/auth/token</w:t>
+        <w:t xml:space="preserve">POST /ftd-spi-employee/rest/security/token</w:t>
       </w:r>
     </w:p>
     <w:p>
@@ -2500,7 +2500,7 @@
           <w:sz w:val="24"/>
           <w:szCs w:val="24"/>
         </w:rPr>
-        <w:t xml:space="preserve">POST /api/v1/employees</w:t>
+        <w:t xml:space="preserve">POST /ftd-spi-employee/rest/employee/create</w:t>
       </w:r>
     </w:p>
     <w:p>
@@ -2950,7 +2950,7 @@
           <w:sz w:val="24"/>
           <w:szCs w:val="24"/>
         </w:rPr>
-        <w:t xml:space="preserve">POST /api/v1/employees/search</w:t>
+        <w:t xml:space="preserve">POST /ftd-spi-employee/rest/employee/get</w:t>
       </w:r>
     </w:p>
     <w:p>
@@ -2980,7 +2980,7 @@
           <w:sz w:val="24"/>
           <w:szCs w:val="24"/>
         </w:rPr>
-        <w:t xml:space="preserve">POST /api/v1/employees/list</w:t>
+        <w:t xml:space="preserve">POST /ftd-spi-employee/rest/employee/list</w:t>
       </w:r>
     </w:p>
     <w:p>
@@ -3010,7 +3010,7 @@
           <w:sz w:val="24"/>
           <w:szCs w:val="24"/>
         </w:rPr>
-        <w:t xml:space="preserve">POST /api/v1/employees/update</w:t>
+        <w:t xml:space="preserve">POST /ftd-spi-employee/rest/employee/update</w:t>
       </w:r>
     </w:p>
     <w:p>
@@ -3040,7 +3040,7 @@
           <w:sz w:val="24"/>
           <w:szCs w:val="24"/>
         </w:rPr>
-        <w:t xml:space="preserve">POST /api/v1/employees/delete</w:t>
+        <w:t xml:space="preserve">POST /ftd-spi-employee/rest/employee/delete</w:t>
       </w:r>
     </w:p>
     <w:p>

</xml_diff>

<commit_message>
docs: remove author field; Postman keeps encrypted CRUD + negatives only; sync cURL doc
- Autor/Revisor removido de SDD, spec, y generadores (SDD + seguridad)
- Postman: eliminado CRUD en claro duplicado; quedan Auth + Employee (P2C) + Negative cases
- cURL guide (md+docx) reescrito al flujo cifrado compacto (helpers enc/dec/post)
- 3 docx regenerados

Co-Authored-By: Claude Fable 5 <noreply@anthropic.com>
</commit_message>
<xml_diff>
--- a/docs/sdd/SDD-ftd-spi-employee-v1.0.docx
+++ b/docs/sdd/SDD-ftd-spi-employee-v1.0.docx
@@ -214,7 +214,7 @@
                 <w:sz w:val="20"/>
                 <w:szCs w:val="20"/>
               </w:rPr>
-              <w:t xml:space="preserve">Autor(es)</w:t>
+              <w:t xml:space="preserve">Fecha</w:t>
             </w:r>
           </w:p>
         </w:tc>
@@ -242,7 +242,7 @@
                 <w:sz w:val="20"/>
                 <w:szCs w:val="20"/>
               </w:rPr>
-              <w:t xml:space="preserve">carlos.rodriguez@farmatodo.com</w:t>
+              <w:t xml:space="preserve">2026-07-02</w:t>
             </w:r>
           </w:p>
         </w:tc>
@@ -271,7 +271,7 @@
                 <w:sz w:val="20"/>
                 <w:szCs w:val="20"/>
               </w:rPr>
-              <w:t xml:space="preserve">Fecha</w:t>
+              <w:t xml:space="preserve">Objetivo</w:t>
             </w:r>
           </w:p>
         </w:tc>
@@ -298,7 +298,7 @@
                 <w:sz w:val="20"/>
                 <w:szCs w:val="20"/>
               </w:rPr>
-              <w:t xml:space="preserve">2026-07-02</w:t>
+              <w:t xml:space="preserve">API RESTful para la gestión de empleados del sistema SPI, multi-tenant por país</w:t>
             </w:r>
           </w:p>
         </w:tc>
@@ -328,7 +328,7 @@
                 <w:sz w:val="20"/>
                 <w:szCs w:val="20"/>
               </w:rPr>
-              <w:t xml:space="preserve">Objetivo</w:t>
+              <w:t xml:space="preserve">Ámbito</w:t>
             </w:r>
           </w:p>
         </w:tc>
@@ -342,62 +342,6 @@
               <w:right w:val="single" w:color="B0B0B0" w:sz="1"/>
             </w:tcBorders>
             <w:shd w:fill="F2F2F2" w:val="clear"/>
-            <w:tcMar>
-              <w:top w:type="dxa" w:w="80"/>
-              <w:left w:type="dxa" w:w="120"/>
-              <w:bottom w:type="dxa" w:w="80"/>
-              <w:right w:type="dxa" w:w="120"/>
-            </w:tcMar>
-          </w:tcPr>
-          <w:p>
-            <w:r>
-              <w:rPr>
-                <w:rFonts w:ascii="Arial" w:cs="Arial" w:eastAsia="Arial" w:hAnsi="Arial"/>
-                <w:sz w:val="20"/>
-                <w:szCs w:val="20"/>
-              </w:rPr>
-              <w:t xml:space="preserve">API RESTful para la gestión de empleados del sistema SPI, multi-tenant por país</w:t>
-            </w:r>
-          </w:p>
-        </w:tc>
-      </w:tr>
-      <w:tr>
-        <w:tc>
-          <w:tcPr>
-            <w:tcW w:type="dxa" w:w="2400"/>
-            <w:tcBorders>
-              <w:top w:val="single" w:color="B0B0B0" w:sz="1"/>
-              <w:left w:val="single" w:color="B0B0B0" w:sz="1"/>
-              <w:bottom w:val="single" w:color="B0B0B0" w:sz="1"/>
-              <w:right w:val="single" w:color="B0B0B0" w:sz="1"/>
-            </w:tcBorders>
-            <w:tcMar>
-              <w:top w:type="dxa" w:w="80"/>
-              <w:left w:type="dxa" w:w="120"/>
-              <w:bottom w:type="dxa" w:w="80"/>
-              <w:right w:type="dxa" w:w="120"/>
-            </w:tcMar>
-          </w:tcPr>
-          <w:p>
-            <w:r>
-              <w:rPr>
-                <w:rFonts w:ascii="Arial" w:cs="Arial" w:eastAsia="Arial" w:hAnsi="Arial"/>
-                <w:sz w:val="20"/>
-                <w:szCs w:val="20"/>
-              </w:rPr>
-              <w:t xml:space="preserve">Ámbito</w:t>
-            </w:r>
-          </w:p>
-        </w:tc>
-        <w:tc>
-          <w:tcPr>
-            <w:tcW w:type="dxa" w:w="6960"/>
-            <w:tcBorders>
-              <w:top w:val="single" w:color="B0B0B0" w:sz="1"/>
-              <w:left w:val="single" w:color="B0B0B0" w:sz="1"/>
-              <w:bottom w:val="single" w:color="B0B0B0" w:sz="1"/>
-              <w:right w:val="single" w:color="B0B0B0" w:sz="1"/>
-            </w:tcBorders>
             <w:tcMar>
               <w:top w:type="dxa" w:w="80"/>
               <w:left w:type="dxa" w:w="120"/>

</xml_diff>

<commit_message>
fix(db): PKG for Oracle 12.1.0.2 — manual JSON build + SPI_KEY id generation
- PRC_GET_EMPLOYEE arma el JSON a mano (12.1 no soporta JSON_OBJECT RETURNING CLOB)
- gender/active con DECODE real (estaban hardcodeados a 1 en el borrador)
- PRC_MERGE_EMPLOYEE: UPDATE-then-INSERT; ID desde INFOCENT.SPI_KEY (FN_NEXT_KEY,
  FOR UPDATE) en vez de secuencia inexistente — evita PK duplicada
- SDD (md+docx) actualizado: riesgos de 12.1/SPI_KEY marcados resueltos
- Contrato JSON sin cambios -> lado Node (API) intacto

Co-Authored-By: Claude Fable 5 <noreply@anthropic.com>
</commit_message>
<xml_diff>
--- a/docs/sdd/SDD-ftd-spi-employee-v1.0.docx
+++ b/docs/sdd/SDD-ftd-spi-employee-v1.0.docx
@@ -4933,7 +4933,7 @@
           <w:sz w:val="22"/>
           <w:szCs w:val="22"/>
         </w:rPr>
-        <w:t xml:space="preserve">El PK ID (NUMBER(20)) es interno; el API identifica por NUM_IDEN. El MERGE inserta con secuencia para ID.</w:t>
+        <w:t xml:space="preserve">El PK ID (NUMBER(20)) es interno; el API identifica por NUM_IDEN. El PKG genera el ID desde INFOCENT.SPI_KEY (name_key=EOPERSONA), no con secuencia.</w:t>
       </w:r>
     </w:p>
     <w:p>
@@ -6479,7 +6479,7 @@
                 <w:sz w:val="20"/>
                 <w:szCs w:val="20"/>
               </w:rPr>
-              <w:t xml:space="preserve">Valores reales de UTILITY.PKG_GLOBAL_CONSTANTS distintos a los asumidos (éxito=0, sin registros=1)</w:t>
+              <w:t xml:space="preserve">Oracle 12.1.0.2: JSON_OBJECT/JSON_ARRAYAGG sin RETURNING CLOB (llegó en 12.2)</w:t>
             </w:r>
           </w:p>
         </w:tc>
@@ -6506,7 +6506,7 @@
                 <w:sz w:val="20"/>
                 <w:szCs w:val="20"/>
               </w:rPr>
-              <w:t xml:space="preserve">Mapeo HTTP incorrecto</w:t>
+              <w:t xml:space="preserve">El GET no arma el JSON con funciones nativas</w:t>
             </w:r>
           </w:p>
         </w:tc>
@@ -6533,7 +6533,7 @@
                 <w:sz w:val="20"/>
                 <w:szCs w:val="20"/>
               </w:rPr>
-              <w:t xml:space="preserve">Constantes concentradas en employees.repository.ts; validarlas al compilar el PKG en el espejo</w:t>
+              <w:t xml:space="preserve">Resuelto: el PKG arma el CLOB a mano (FN_JSON_ESCAPE/FN_JSON_PAIR + DBMS_LOB). JSON_TABLE y OFFSET/FETCH sí están en 12.1</w:t>
             </w:r>
           </w:p>
         </w:tc>
@@ -6563,7 +6563,7 @@
                 <w:sz w:val="20"/>
                 <w:szCs w:val="20"/>
               </w:rPr>
-              <w:t xml:space="preserve">Nombre de la secuencia para EO_PERSONA.ID desconocido</w:t>
+              <w:t xml:space="preserve">No existe secuencia para EO_PERSONA.ID</w:t>
             </w:r>
           </w:p>
         </w:tc>
@@ -6591,7 +6591,7 @@
                 <w:sz w:val="20"/>
                 <w:szCs w:val="20"/>
               </w:rPr>
-              <w:t xml:space="preserve">El INSERT del MERGE falla</w:t>
+              <w:t xml:space="preserve">El INSERT no genera el PK</w:t>
             </w:r>
           </w:p>
         </w:tc>
@@ -6619,7 +6619,7 @@
                 <w:sz w:val="20"/>
                 <w:szCs w:val="20"/>
               </w:rPr>
-              <w:t xml:space="preserve">Parámetro en el script SQL; confirmar con el DBA</w:t>
+              <w:t xml:space="preserve">Resuelto: el ID sale de INFOCENT.SPI_KEY (name_key=EOPERSONA) vía FN_NEXT_KEY con FOR UPDATE</w:t>
             </w:r>
           </w:p>
         </w:tc>
@@ -6648,7 +6648,7 @@
                 <w:sz w:val="20"/>
                 <w:szCs w:val="20"/>
               </w:rPr>
-              <w:t xml:space="preserve">VPC connector no disponible a tiempo</w:t>
+              <w:t xml:space="preserve">Valores reales de PKG_GLOBAL_CONSTANTS distintos a los asumidos</w:t>
             </w:r>
           </w:p>
         </w:tc>
@@ -6675,7 +6675,7 @@
                 <w:sz w:val="20"/>
                 <w:szCs w:val="20"/>
               </w:rPr>
-              <w:t xml:space="preserve">Bloquea despliegue e integración (Sprint 3)</w:t>
+              <w:t xml:space="preserve">Mapeo HTTP incorrecto</w:t>
             </w:r>
           </w:p>
         </w:tc>
@@ -6702,7 +6702,7 @@
                 <w:sz w:val="20"/>
                 <w:szCs w:val="20"/>
               </w:rPr>
-              <w:t xml:space="preserve">Solicitarlo desde el Sprint 1; desarrollo y tests no dependen de la BD</w:t>
+              <w:t xml:space="preserve">Constantes en employees.repository.ts; validarlas al compilar el PKG</w:t>
             </w:r>
           </w:p>
         </w:tc>
@@ -6732,7 +6732,7 @@
                 <w:sz w:val="20"/>
                 <w:szCs w:val="20"/>
               </w:rPr>
-              <w:t xml:space="preserve">Agotamiento de conexiones Oracle por escalado de Cloud Run</w:t>
+              <w:t xml:space="preserve">VPC connector no disponible a tiempo</w:t>
             </w:r>
           </w:p>
         </w:tc>
@@ -6760,7 +6760,7 @@
                 <w:sz w:val="20"/>
                 <w:szCs w:val="20"/>
               </w:rPr>
-              <w:t xml:space="preserve">Errores 500 bajo carga</w:t>
+              <w:t xml:space="preserve">Bloquea despliegue e integración (Sprint 3)</w:t>
             </w:r>
           </w:p>
         </w:tc>
@@ -6788,7 +6788,7 @@
                 <w:sz w:val="20"/>
                 <w:szCs w:val="20"/>
               </w:rPr>
-              <w:t xml:space="preserve">concurrency alineado a POOL_MAX; min-instances=1; monitoreo en /health/ready</w:t>
+              <w:t xml:space="preserve">Solicitarlo desde el Sprint 1; desarrollo y tests no dependen de la BD</w:t>
             </w:r>
           </w:p>
         </w:tc>
@@ -6817,7 +6817,7 @@
                 <w:sz w:val="20"/>
                 <w:szCs w:val="20"/>
               </w:rPr>
-              <w:t xml:space="preserve">Fuga de secretos (llaves RSA, credenciales)</w:t>
+              <w:t xml:space="preserve">Agotamiento de conexiones Oracle por escalado de Cloud Run</w:t>
             </w:r>
           </w:p>
         </w:tc>
@@ -6844,7 +6844,7 @@
                 <w:sz w:val="20"/>
                 <w:szCs w:val="20"/>
               </w:rPr>
-              <w:t xml:space="preserve">Acceso indebido a datos de empleados</w:t>
+              <w:t xml:space="preserve">Errores 500 bajo carga</w:t>
             </w:r>
           </w:p>
         </w:tc>
@@ -6871,7 +6871,7 @@
                 <w:sz w:val="20"/>
                 <w:szCs w:val="20"/>
               </w:rPr>
-              <w:t xml:space="preserve">Secret Manager exclusivamente; nunca en repo ni logs; rotación documentada</w:t>
+              <w:t xml:space="preserve">concurrency alineado a POOL_MAX; min-instances=1; monitoreo en /health/ready</w:t>
             </w:r>
           </w:p>
         </w:tc>
@@ -6901,6 +6901,91 @@
                 <w:sz w:val="20"/>
                 <w:szCs w:val="20"/>
               </w:rPr>
+              <w:t xml:space="preserve">Fuga de secretos (llaves RSA, credenciales)</w:t>
+            </w:r>
+          </w:p>
+        </w:tc>
+        <w:tc>
+          <w:tcPr>
+            <w:tcW w:type="dxa" w:w="2400"/>
+            <w:tcBorders>
+              <w:top w:val="single" w:color="B0B0B0" w:sz="1"/>
+              <w:left w:val="single" w:color="B0B0B0" w:sz="1"/>
+              <w:bottom w:val="single" w:color="B0B0B0" w:sz="1"/>
+              <w:right w:val="single" w:color="B0B0B0" w:sz="1"/>
+            </w:tcBorders>
+            <w:shd w:fill="F2F2F2" w:val="clear"/>
+            <w:tcMar>
+              <w:top w:type="dxa" w:w="80"/>
+              <w:left w:type="dxa" w:w="120"/>
+              <w:bottom w:type="dxa" w:w="80"/>
+              <w:right w:type="dxa" w:w="120"/>
+            </w:tcMar>
+          </w:tcPr>
+          <w:p>
+            <w:r>
+              <w:rPr>
+                <w:rFonts w:ascii="Arial" w:cs="Arial" w:eastAsia="Arial" w:hAnsi="Arial"/>
+                <w:sz w:val="20"/>
+                <w:szCs w:val="20"/>
+              </w:rPr>
+              <w:t xml:space="preserve">Acceso indebido a datos de empleados</w:t>
+            </w:r>
+          </w:p>
+        </w:tc>
+        <w:tc>
+          <w:tcPr>
+            <w:tcW w:type="dxa" w:w="3960"/>
+            <w:tcBorders>
+              <w:top w:val="single" w:color="B0B0B0" w:sz="1"/>
+              <w:left w:val="single" w:color="B0B0B0" w:sz="1"/>
+              <w:bottom w:val="single" w:color="B0B0B0" w:sz="1"/>
+              <w:right w:val="single" w:color="B0B0B0" w:sz="1"/>
+            </w:tcBorders>
+            <w:shd w:fill="F2F2F2" w:val="clear"/>
+            <w:tcMar>
+              <w:top w:type="dxa" w:w="80"/>
+              <w:left w:type="dxa" w:w="120"/>
+              <w:bottom w:type="dxa" w:w="80"/>
+              <w:right w:type="dxa" w:w="120"/>
+            </w:tcMar>
+          </w:tcPr>
+          <w:p>
+            <w:r>
+              <w:rPr>
+                <w:rFonts w:ascii="Arial" w:cs="Arial" w:eastAsia="Arial" w:hAnsi="Arial"/>
+                <w:sz w:val="20"/>
+                <w:szCs w:val="20"/>
+              </w:rPr>
+              <w:t xml:space="preserve">Secret Manager exclusivamente; nunca en repo ni logs; rotación documentada</w:t>
+            </w:r>
+          </w:p>
+        </w:tc>
+      </w:tr>
+      <w:tr>
+        <w:tc>
+          <w:tcPr>
+            <w:tcW w:type="dxa" w:w="3000"/>
+            <w:tcBorders>
+              <w:top w:val="single" w:color="B0B0B0" w:sz="1"/>
+              <w:left w:val="single" w:color="B0B0B0" w:sz="1"/>
+              <w:bottom w:val="single" w:color="B0B0B0" w:sz="1"/>
+              <w:right w:val="single" w:color="B0B0B0" w:sz="1"/>
+            </w:tcBorders>
+            <w:tcMar>
+              <w:top w:type="dxa" w:w="80"/>
+              <w:left w:type="dxa" w:w="120"/>
+              <w:bottom w:type="dxa" w:w="80"/>
+              <w:right w:type="dxa" w:w="120"/>
+            </w:tcMar>
+          </w:tcPr>
+          <w:p>
+            <w:r>
+              <w:rPr>
+                <w:rFonts w:ascii="Arial" w:cs="Arial" w:eastAsia="Arial" w:hAnsi="Arial"/>
+                <w:sz w:val="20"/>
+                <w:szCs w:val="20"/>
+              </w:rPr>
               <w:t xml:space="preserve">TTL de 12h del token comprometido</w:t>
             </w:r>
           </w:p>
@@ -6914,7 +6999,6 @@
               <w:bottom w:val="single" w:color="B0B0B0" w:sz="1"/>
               <w:right w:val="single" w:color="B0B0B0" w:sz="1"/>
             </w:tcBorders>
-            <w:shd w:fill="F2F2F2" w:val="clear"/>
             <w:tcMar>
               <w:top w:type="dxa" w:w="80"/>
               <w:left w:type="dxa" w:w="120"/>
@@ -6942,7 +7026,6 @@
               <w:bottom w:val="single" w:color="B0B0B0" w:sz="1"/>
               <w:right w:val="single" w:color="B0B0B0" w:sz="1"/>
             </w:tcBorders>
-            <w:shd w:fill="F2F2F2" w:val="clear"/>
             <w:tcMar>
               <w:top w:type="dxa" w:w="80"/>
               <w:left w:type="dxa" w:w="120"/>

</xml_diff>

<commit_message>
docs: reconcile SDD with real impl — prc_merge_employee, UPDATE/INSERT+SPI_KEY, JSON contract
- Reemplaza referencias obsoletas (prc_crear_datos_basicos, EMPLOYEE_FIELD_MAP binds, MERGE, /auth/token)
- Flujo, contratos, drivers y endpoints alineados al contrato JSON y a Oracle 12.1
- SDD md + docx regenerados

Co-Authored-By: Claude Fable 5 <noreply@anthropic.com>
</commit_message>
<xml_diff>
--- a/docs/sdd/SDD-ftd-spi-employee-v1.0.docx
+++ b/docs/sdd/SDD-ftd-spi-employee-v1.0.docx
@@ -852,7 +852,7 @@
                 <w:sz w:val="20"/>
                 <w:szCs w:val="20"/>
               </w:rPr>
-              <w:t xml:space="preserve">POST /auth/token (JWT RS256 TTL 12h); CRUD /ftd-spi-employee/rest/employee/create vía PKG (MERGE/GET JSON); middleware X-Country-Code ISO 3166-1 alfa-2; pools Oracle por país (VE activo); Cloud Run + Cloud Build; Swagger; SonarQube ≥80%</w:t>
+              <w:t xml:space="preserve">POST /security/token (JWT RS256 TTL 12h); CRUD por POST vía PKG (contrato I_JSON/O_JSON); middleware X-Country-Code ISO 3166-1 alfa-2; pools Oracle por país (VE activo); Cloud Run + Cloud Build; Swagger; SonarQube ≥80%</w:t>
             </w:r>
           </w:p>
         </w:tc>
@@ -1014,7 +1014,7 @@
           <w:sz w:val="22"/>
           <w:szCs w:val="22"/>
         </w:rPr>
-        <w:t xml:space="preserve"> toda la operación pasa por corsox.pkg_management_employee con el contrato I_JSON CLOB → O_JSON/O_COD/O_MESSAGE: GET con JSON_ARRAYAGG/JSON_OBJECT, escrituras con MERGE + JSON_TABLE, códigos de UTILITY.PKG_GLOBAL_CONSTANTS. La lógica de negocio permanece en la BD.</w:t>
+        <w:t xml:space="preserve"> toda la operación pasa por corsox.pkg_management_employee con el contrato I_JSON CLOB → O_JSON/O_COD/O_MESSAGE: Oracle 12.1: entrada con JSON_TABLE, GET arma el JSON a mano (DBMS_LOB), escrituras UPDATE/INSERT con ID de SPI_KEY, códigos de PKG_GLOBAL_CONSTANTS. La lógica de negocio permanece en la BD.</w:t>
       </w:r>
     </w:p>
     <w:p>
@@ -2026,7 +2026,7 @@
           <w:sz w:val="22"/>
           <w:szCs w:val="22"/>
         </w:rPr>
-        <w:t xml:space="preserve">El sistema cliente solicita token: POST /auth/token con client_id/client_secret.</w:t>
+        <w:t xml:space="preserve">El sistema cliente solicita token: POST /security/token con client_id/client_secret.</w:t>
       </w:r>
     </w:p>
     <w:p>
@@ -2098,7 +2098,7 @@
           <w:sz w:val="22"/>
           <w:szCs w:val="22"/>
         </w:rPr>
-        <w:t xml:space="preserve">El middleware de tenancy valida el header (400/422/403) y resuelve el pool Oracle de VE.</w:t>
+        <w:t xml:space="preserve">El guard de tenancy valida el header (400/422/403) y resuelve el pool Oracle de VE.</w:t>
       </w:r>
     </w:p>
     <w:p>
@@ -2457,7 +2457,7 @@
           <w:sz w:val="22"/>
           <w:szCs w:val="22"/>
         </w:rPr>
-        <w:t xml:space="preserve">Crea el empleado. El API arma I_JSON = {"employees":[{...}]} y llama prc_merge_employee; el PKG hace MERGE sobre EO_PERSONA casando por NUM_IDEN.</w:t>
+        <w:t xml:space="preserve">Crea el empleado. El API arma I_JSON = {"employees":[{...}]} y llama prc_merge_employee; el PKG hace UPDATE por NUM_IDEN; si no existe, INSERT con el ID de SPI_KEY.</w:t>
       </w:r>
     </w:p>
     <w:p>
@@ -2967,7 +2967,7 @@
           <w:sz w:val="22"/>
           <w:szCs w:val="22"/>
         </w:rPr>
-        <w:t xml:space="preserve">Actualización parcial: idNumber (requerido) + campos a actualizar en el body. Verifica existencia (404 si no existe), reutiliza prc_merge_employee (rama WHEN MATCHED del MERGE) y devuelve el empleado actualizado.</w:t>
+        <w:t xml:space="preserve">Actualización parcial: idNumber (requerido) + campos a actualizar en el body. Verifica existencia (404 si no existe), reutiliza prc_merge_employee (rama UPDATE) y devuelve el empleado actualizado.</w:t>
       </w:r>
     </w:p>
     <w:p>
@@ -3523,7 +3523,7 @@
                 <w:sz w:val="20"/>
                 <w:szCs w:val="20"/>
               </w:rPr>
-              <w:t xml:space="preserve">PRC_MERGE_EMPLOYEE(I_JSON, O_COD, O_MESSAGE) — MERGE por NUM_IDEN</w:t>
+              <w:t xml:space="preserve">PRC_MERGE_EMPLOYEE(I_JSON) — UPDATE/INSERT por NUM_IDEN; ID de SPI_KEY</w:t>
             </w:r>
           </w:p>
         </w:tc>
@@ -4987,7 +4987,7 @@
           <w:sz w:val="22"/>
           <w:szCs w:val="22"/>
         </w:rPr>
-        <w:t xml:space="preserve">Idempotencia: el MERGE es idempotente por NUM_IDEN; validaciones del PKG → O_COD ≠ éxito → 422.</w:t>
+        <w:t xml:space="preserve">Idempotencia: el upsert es idempotente por NUM_IDEN; validaciones del PKG → O_COD ≠ éxito → 422.</w:t>
       </w:r>
     </w:p>
     <w:p>
@@ -5400,7 +5400,7 @@
                 <w:sz w:val="20"/>
                 <w:szCs w:val="20"/>
               </w:rPr>
-              <w:t xml:space="preserve">@nestjs/throttler: 60 req/min global, 10 req/min en /auth/token (429)</w:t>
+              <w:t xml:space="preserve">@nestjs/throttler: 60 req/min global, 10 req/min en /security/token (429)</w:t>
             </w:r>
           </w:p>
         </w:tc>
@@ -7800,7 +7800,7 @@
           <w:sz w:val="22"/>
           <w:szCs w:val="22"/>
         </w:rPr>
-        <w:t xml:space="preserve">La V1 construye un servicio NestJS multi-tenant que expone el CRUD de empleados del SPI cumpliendo las cinco premisas: nube nativa GCP (Cloud Run), JWT RS256 con TTL de 12 horas, aislamiento por país vía X-Country-Code, diseño REST estricto y operación PKG-first con el contrato JSON estándar de FTD. La separación de responsabilidades clave es: la lógica de negocio permanece en el paquete Oracle (MERGE/GET sobre EO_PERSONA), el servicio aporta el contrato REST en inglés, la seguridad y el enrutamiento multi-tenant. La evolución recomendada es habilitar AR/CO por configuración cuando existan sus BD espejo y evaluar carga por lotes asíncrona si el volumen lo demanda.</w:t>
+        <w:t xml:space="preserve">La V1 construye un servicio NestJS multi-tenant que expone el CRUD de empleados del SPI cumpliendo las cinco premisas: nube nativa GCP (Cloud Run), JWT RS256 con TTL de 12 horas, aislamiento por país vía X-Country-Code, diseño REST estricto y operación PKG-first con el contrato JSON estándar de FTD. La separación de responsabilidades clave es: la lógica de negocio permanece en el paquete Oracle (UPDATE/INSERT/GET sobre EO_PERSONA), el servicio aporta el contrato REST en inglés, la seguridad y el enrutamiento multi-tenant. La evolución recomendada es habilitar AR/CO por configuración cuando existan sus BD espejo y evaluar carga por lotes asíncrona si el volumen lo demanda.</w:t>
       </w:r>
     </w:p>
     <w:sectPr>

</xml_diff>